<commit_message>
JIRA-123: Add recruiter-focused engineering achievements
</commit_message>
<xml_diff>
--- a/output/docx/Saurabh_Tiwari_Resume_Editable.docx
+++ b/output/docx/Saurabh_Tiwari_Resume_Editable.docx
@@ -96,7 +96,7 @@
           <w:color w:val="202622"/>
           <w:sz w:val="17"/>
         </w:rPr>
-        <w:t>Senior DevOps Engineer with 8+ years of experience in cloud infrastructure, platform reliability, CI/CD automation, observability, and production incident response. Experienced with AWS, Kubernetes, Docker, Terraform, Jenkins, and monitoring platforms across multi-region environments.</w:t>
+        <w:t>Senior DevOps Engineer with 8+ years of experience delivering cloud, Kubernetes, and bare-metal platforms across global production environments. Specializes in CI/CD automation, FedRAMP/FIPS delivery, observability, infrastructure reliability, and production incident response.</w:t>
       </w:r>
     </w:p>
     <w:p>
@@ -135,7 +135,7 @@
           <w:color w:val="202622"/>
           <w:sz w:val="17"/>
         </w:rPr>
-        <w:t>AWS, Amazon EKS, Kubernetes, Docker, Helm, Terraform</w:t>
+        <w:t>AWS, Amazon EKS, Kubernetes, Docker, Helm, Terraform, Bare Metal, PXE</w:t>
       </w:r>
       <w:r>
         <w:br/>
@@ -156,7 +156,7 @@
           <w:color w:val="202622"/>
           <w:sz w:val="17"/>
         </w:rPr>
-        <w:t>Jenkins, CI/CD, Python, Bash, Shell, Go, Linux, Unix</w:t>
+        <w:t>Jenkins, CI/CD, Ansible, Python, Bash, Shell, Go, Linux, Unix</w:t>
       </w:r>
       <w:r>
         <w:br/>
@@ -177,7 +177,7 @@
           <w:color w:val="202622"/>
           <w:sz w:val="17"/>
         </w:rPr>
-        <w:t>Datadog, Grafana, Prometheus, Splunk, CloudWatch, PagerDuty</w:t>
+        <w:t>Datadog, Grafana, Prometheus, Splunk, Nagios, CloudWatch, PagerDuty</w:t>
       </w:r>
       <w:r>
         <w:br/>
@@ -198,7 +198,7 @@
           <w:color w:val="202622"/>
           <w:sz w:val="17"/>
         </w:rPr>
-        <w:t>DevSecOps, incident response, root-cause analysis, SLOs, Agile</w:t>
+        <w:t>FedRAMP, FIPS 140-3, DevSecOps, incident response, root-cause analysis, SLOs</w:t>
       </w:r>
     </w:p>
     <w:p>
@@ -260,7 +260,7 @@
           <w:color w:val="202622"/>
           <w:sz w:val="16"/>
         </w:rPr>
-        <w:t>Built Docker images and Kubernetes delivery workflows for multi-region services, including FedRAMP and China environments.</w:t>
+        <w:t>Manage a global fleet of 62 bare-metal Landers hosts across Stage, Dogfood, Early, General-1, and General-2; provision UCS hosts using PXE and Ansible, automate encrypted-disk secrets, validate Nagios, and move capacity into production rotation.</w:t>
       </w:r>
     </w:p>
     <w:p>
@@ -276,7 +276,7 @@
           <w:color w:val="202622"/>
           <w:sz w:val="16"/>
         </w:rPr>
-        <w:t>Created reusable Terraform modules for AWS infrastructure, reducing reported provisioning time by 70%.</w:t>
+        <w:t>Delivered IPv6 support for FedRAMP Landers through production by automating dual-stack NLB configuration and coordinating network dependencies, Jenkins changes, monitoring, and end-to-end validation.</w:t>
       </w:r>
     </w:p>
     <w:p>
@@ -292,7 +292,7 @@
           <w:color w:val="202622"/>
           <w:sz w:val="16"/>
         </w:rPr>
-        <w:t>Developed Jenkins pipelines and infrastructure automation for repeatable multi-environment deployments.</w:t>
+        <w:t>Led the GovCloud migration of NGINX and MITMD services from Debian 11 to Debian 12, resolving FIPS build and test failures and coordinating change approval and production deployment.</w:t>
       </w:r>
     </w:p>
     <w:p>
@@ -308,7 +308,7 @@
           <w:color w:val="202622"/>
           <w:sz w:val="16"/>
         </w:rPr>
-        <w:t>Created Python and Bash automation for application build, deployment, and testing workflows, and coordinated production releases across platform teams.</w:t>
+        <w:t>Built and maintained Jenkins pipelines for AWS secret automation and China EKS infrastructure and service deployments, with CI/CD validation across China, GovCloud, and Neutrino environments.</w:t>
       </w:r>
     </w:p>
     <w:p>
@@ -324,7 +324,7 @@
           <w:color w:val="202622"/>
           <w:sz w:val="16"/>
         </w:rPr>
-        <w:t>Helped migrate monitoring from Datadog to Splunk, with reported savings of approximately $1,000 per month.</w:t>
+        <w:t>Executed staged iProxy releases across 13 global data centers and coordinated certificate renewals for NGINX Proxy, Sharkd URL Filter, Zeus Policy Server, and supporting monitors.</w:t>
       </w:r>
     </w:p>
     <w:p>
@@ -340,7 +340,23 @@
           <w:color w:val="202622"/>
           <w:sz w:val="16"/>
         </w:rPr>
-        <w:t>Integrated PagerDuty with Grafana, built SLO dashboards, configured Datadog logging for EKS, and performed production root-cause analysis.</w:t>
+        <w:t>Improved reliability by migrating Landers and iProxy dashboards to Grafana 9, integrating PagerDuty for NOC coverage, and stabilizing Datadog and GovCloud monitors across development, stage, and production.</w:t>
+      </w:r>
+    </w:p>
+    <w:p>
+      <w:pPr>
+        <w:pStyle w:val="ListBullet"/>
+        <w:spacing w:after="10" w:line="240" w:lineRule="auto"/>
+        <w:ind w:left="255" w:hanging="142"/>
+      </w:pPr>
+      <w:r>
+        <w:rPr>
+          <w:rFonts w:ascii="Arial" w:hAnsi="Arial"/>
+          <w:b w:val="0"/>
+          <w:color w:val="202622"/>
+          <w:sz w:val="16"/>
+        </w:rPr>
+        <w:t>Produced a FedRAMP cryptographic inventory and CBOM covering TLS, keys, certificates, Kubernetes Secrets, container signing, and FIPS 140-3 dependencies across Landers services.</w:t>
       </w:r>
     </w:p>
     <w:p>
@@ -496,7 +512,7 @@
           <w:color w:val="202622"/>
           <w:sz w:val="16"/>
         </w:rPr>
-        <w:t>Led bare-metal server provisioning and supported systems operations, incident handling, and service reliability improvements.</w:t>
+        <w:t>Provided production systems support, resolved customer and service incidents, and contributed to operational reliability improvements.</w:t>
       </w:r>
     </w:p>
     <w:p>

</xml_diff>

<commit_message>
JIRA-123: Generalize resume experience descriptions
</commit_message>
<xml_diff>
--- a/output/docx/Saurabh_Tiwari_Resume_Editable.docx
+++ b/output/docx/Saurabh_Tiwari_Resume_Editable.docx
@@ -260,7 +260,7 @@
           <w:color w:val="202622"/>
           <w:sz w:val="16"/>
         </w:rPr>
-        <w:t>Manage a global fleet of 62 bare-metal Landers hosts across Stage, Dogfood, Early, General-1, and General-2; provision UCS hosts using PXE and Ansible, automate encrypted-disk secrets, validate Nagios, and move capacity into production rotation.</w:t>
+        <w:t>Manage a global fleet of 62 bare-metal servers across development, pre-production, and production environments; provision hosts using PXE and Ansible, automate encrypted-disk secrets, validate Nagios, and move capacity into production rotation.</w:t>
       </w:r>
     </w:p>
     <w:p>
@@ -276,7 +276,7 @@
           <w:color w:val="202622"/>
           <w:sz w:val="16"/>
         </w:rPr>
-        <w:t>Delivered IPv6 support for FedRAMP Landers through production by automating dual-stack NLB configuration and coordinating network dependencies, Jenkins changes, monitoring, and end-to-end validation.</w:t>
+        <w:t>Delivered IPv6 support for a regulated cloud platform through production by automating dual-stack NLB configuration and coordinating network dependencies, Jenkins changes, monitoring, and end-to-end validation.</w:t>
       </w:r>
     </w:p>
     <w:p>
@@ -292,7 +292,7 @@
           <w:color w:val="202622"/>
           <w:sz w:val="16"/>
         </w:rPr>
-        <w:t>Led the GovCloud migration of NGINX and MITMD services from Debian 11 to Debian 12, resolving FIPS build and test failures and coordinating change approval and production deployment.</w:t>
+        <w:t>Led the migration of containerized edge services from Debian 11 to Debian 12 in a regulated environment, resolving FIPS build and test failures and coordinating change approval and production deployment.</w:t>
       </w:r>
     </w:p>
     <w:p>
@@ -308,7 +308,7 @@
           <w:color w:val="202622"/>
           <w:sz w:val="16"/>
         </w:rPr>
-        <w:t>Built and maintained Jenkins pipelines for AWS secret automation and China EKS infrastructure and service deployments, with CI/CD validation across China, GovCloud, and Neutrino environments.</w:t>
+        <w:t>Built and maintained Jenkins pipelines for AWS secret automation and EKS infrastructure and service deployments, with CI/CD validation across regional and regulated environments.</w:t>
       </w:r>
     </w:p>
     <w:p>
@@ -324,7 +324,7 @@
           <w:color w:val="202622"/>
           <w:sz w:val="16"/>
         </w:rPr>
-        <w:t>Executed staged iProxy releases across 13 global data centers and coordinated certificate renewals for NGINX Proxy, Sharkd URL Filter, Zeus Policy Server, and supporting monitors.</w:t>
+        <w:t>Executed staged production releases across 13 global data centers and coordinated certificate renewals for multiple proxy and security services and their supporting monitors.</w:t>
       </w:r>
     </w:p>
     <w:p>
@@ -340,7 +340,7 @@
           <w:color w:val="202622"/>
           <w:sz w:val="16"/>
         </w:rPr>
-        <w:t>Improved reliability by migrating Landers and iProxy dashboards to Grafana 9, integrating PagerDuty for NOC coverage, and stabilizing Datadog and GovCloud monitors across development, stage, and production.</w:t>
+        <w:t>Improved reliability by migrating infrastructure and application dashboards to Grafana 9, integrating PagerDuty for on-call coverage, and stabilizing Datadog monitoring across development, pre-production, and production.</w:t>
       </w:r>
     </w:p>
     <w:p>
@@ -356,7 +356,7 @@
           <w:color w:val="202622"/>
           <w:sz w:val="16"/>
         </w:rPr>
-        <w:t>Produced a FedRAMP cryptographic inventory and CBOM covering TLS, keys, certificates, Kubernetes Secrets, container signing, and FIPS 140-3 dependencies across Landers services.</w:t>
+        <w:t>Produced a FedRAMP cryptographic inventory and CBOM covering TLS, keys, certificates, Kubernetes Secrets, container signing, and FIPS 140-3 dependencies across cloud and edge services.</w:t>
       </w:r>
     </w:p>
     <w:p>

</xml_diff>

<commit_message>
JIRA-123: Expand Cisco and TCS resume experience
</commit_message>
<xml_diff>
--- a/output/docx/Saurabh_Tiwari_Resume_Editable.docx
+++ b/output/docx/Saurabh_Tiwari_Resume_Editable.docx
@@ -324,6 +324,22 @@
           <w:color w:val="202622"/>
           <w:sz w:val="16"/>
         </w:rPr>
+        <w:t>Designed and maintained AWS infrastructure as code using reusable Terraform modules and standardized container build and deployment workflows for multi-environment releases.</w:t>
+      </w:r>
+    </w:p>
+    <w:p>
+      <w:pPr>
+        <w:pStyle w:val="ListBullet"/>
+        <w:spacing w:after="10" w:line="240" w:lineRule="auto"/>
+        <w:ind w:left="255" w:hanging="142"/>
+      </w:pPr>
+      <w:r>
+        <w:rPr>
+          <w:rFonts w:ascii="Arial" w:hAnsi="Arial"/>
+          <w:b w:val="0"/>
+          <w:color w:val="202622"/>
+          <w:sz w:val="16"/>
+        </w:rPr>
         <w:t>Executed staged production releases across 13 global data centers and coordinated certificate renewals for multiple proxy and security services and their supporting monitors.</w:t>
       </w:r>
     </w:p>
@@ -357,6 +373,22 @@
           <w:sz w:val="16"/>
         </w:rPr>
         <w:t>Produced a FedRAMP cryptographic inventory and CBOM covering TLS, keys, certificates, Kubernetes Secrets, container signing, and FIPS 140-3 dependencies across cloud and edge services.</w:t>
+      </w:r>
+    </w:p>
+    <w:p>
+      <w:pPr>
+        <w:pStyle w:val="ListBullet"/>
+        <w:spacing w:after="10" w:line="240" w:lineRule="auto"/>
+        <w:ind w:left="255" w:hanging="142"/>
+      </w:pPr>
+      <w:r>
+        <w:rPr>
+          <w:rFonts w:ascii="Arial" w:hAnsi="Arial"/>
+          <w:b w:val="0"/>
+          <w:color w:val="202622"/>
+          <w:sz w:val="16"/>
+        </w:rPr>
+        <w:t>Diagnosed production incidents involving malformed requests, certificate chains, DNS, and monitoring failures; documented root causes and coordinated permanent fixes with platform teams.</w:t>
       </w:r>
     </w:p>
     <w:p>
@@ -434,7 +466,7 @@
           <w:color w:val="202622"/>
           <w:sz w:val="16"/>
         </w:rPr>
-        <w:t>Configured Splunk and AppDynamics alerts, investigated server overloads, and resolved or escalated incidents within SLA.</w:t>
+        <w:t>Owned first-touch incident triage and escalation, troubleshooting application and server issues within SLA and communicating status to clients and technical stakeholders.</w:t>
       </w:r>
     </w:p>
     <w:p>
@@ -450,7 +482,39 @@
           <w:color w:val="202622"/>
           <w:sz w:val="16"/>
         </w:rPr>
-        <w:t>Administered Jenkins dashboards for multiple teams, performed upgrades, and supported Linux and certificate maintenance.</w:t>
+        <w:t>Configured Splunk and AppDynamics alerts, investigated server overloads, analyzed recurring failures, and coordinated corrective actions.</w:t>
+      </w:r>
+    </w:p>
+    <w:p>
+      <w:pPr>
+        <w:pStyle w:val="ListBullet"/>
+        <w:spacing w:after="10" w:line="240" w:lineRule="auto"/>
+        <w:ind w:left="255" w:hanging="142"/>
+      </w:pPr>
+      <w:r>
+        <w:rPr>
+          <w:rFonts w:ascii="Arial" w:hAnsi="Arial"/>
+          <w:b w:val="0"/>
+          <w:color w:val="202622"/>
+          <w:sz w:val="16"/>
+        </w:rPr>
+        <w:t>Administered Jenkins for multiple delivery teams, including dashboards, upgrades, security maintenance, and build reliability support.</w:t>
+      </w:r>
+    </w:p>
+    <w:p>
+      <w:pPr>
+        <w:pStyle w:val="ListBullet"/>
+        <w:spacing w:after="10" w:line="240" w:lineRule="auto"/>
+        <w:ind w:left="255" w:hanging="142"/>
+      </w:pPr>
+      <w:r>
+        <w:rPr>
+          <w:rFonts w:ascii="Arial" w:hAnsi="Arial"/>
+          <w:b w:val="0"/>
+          <w:color w:val="202622"/>
+          <w:sz w:val="16"/>
+        </w:rPr>
+        <w:t>Supported Linux and Unix systems, certificate maintenance, application releases, and customer-reported production issues.</w:t>
       </w:r>
     </w:p>
     <w:p>
@@ -513,6 +577,22 @@
           <w:sz w:val="16"/>
         </w:rPr>
         <w:t>Provided production systems support, resolved customer and service incidents, and contributed to operational reliability improvements.</w:t>
+      </w:r>
+    </w:p>
+    <w:p>
+      <w:pPr>
+        <w:pStyle w:val="ListBullet"/>
+        <w:spacing w:after="10" w:line="240" w:lineRule="auto"/>
+        <w:ind w:left="255" w:hanging="142"/>
+      </w:pPr>
+      <w:r>
+        <w:rPr>
+          <w:rFonts w:ascii="Arial" w:hAnsi="Arial"/>
+          <w:b w:val="0"/>
+          <w:color w:val="202622"/>
+          <w:sz w:val="16"/>
+        </w:rPr>
+        <w:t>Collaborated with development and infrastructure teams to troubleshoot defects, coordinate deployments, and improve service stability.</w:t>
       </w:r>
     </w:p>
     <w:p>

</xml_diff>